<commit_message>
fix: SonarSource analisia zerora jaitsi eta Word ebidentziak gehitu
</commit_message>
<xml_diff>
--- a/Ziber-24-25-E2-Web_Docker.docx
+++ b/Ziber-24-25-E2-Web_Docker.docx
@@ -5047,6 +5047,1441 @@
                     <a:xfrm>
                       <a:off x="0" y="0"/>
                       <a:ext cx="5100000" cy="3825000"/>
+                    </a:xfrm>
+                    <a:prstGeom prst="rect">
+                      <a:avLst/>
+                    </a:prstGeom>
+                  </pic:spPr>
+                </pic:pic>
+              </a:graphicData>
+            </a:graphic>
+          </wp:inline>
+        </w:drawing>
+      </w:r>
+    </w:p>
+    <w:p>
+      <w:r>
+        <w:br w:type="page"/>
+      </w:r>
+    </w:p>
+    <w:p>
+      <w:pPr>
+        <w:spacing w:after="140"/>
+        <w:keepNext/>
+        <w:outlineLvl w:val="1"/>
+      </w:pPr>
+      <w:r>
+        <w:rPr>
+          <w:rFonts w:ascii="Arial" w:hAnsi="Arial"/>
+          <w:sz w:val="27"/>
+          <w:lang w:val="eu-ES"/>
+          <w:b/>
+        </w:rPr>
+        <w:t xml:space="preserve">SONAR-002 — Berranalisi osoa eta 0 incidientziaren egiaztapena</w:t>
+      </w:r>
+    </w:p>
+    <w:p>
+      <w:pPr>
+        <w:spacing w:after="140"/>
+      </w:pPr>
+      <w:r>
+        <w:rPr>
+          <w:rFonts w:ascii="Arial" w:hAnsi="Arial"/>
+          <w:sz w:val="22"/>
+          <w:lang w:val="eu-ES"/>
+        </w:rPr>
+        <w:t xml:space="preserve">Data: 2026-10-27. Aurreko SONAR-001 ataleko berranalisiaren zain egoera historikoa da: oraingo atal honetan benetako analisi berria eta zuzenketen azken emaitza jasotzen dira.</w:t>
+      </w:r>
+    </w:p>
+    <w:p>
+      <w:pPr>
+        <w:spacing w:after="140"/>
+        <w:keepNext/>
+        <w:outlineLvl w:val="1"/>
+      </w:pPr>
+      <w:r>
+        <w:rPr>
+          <w:rFonts w:ascii="Arial" w:hAnsi="Arial"/>
+          <w:sz w:val="27"/>
+          <w:lang w:val="eu-ES"/>
+          <w:b/>
+        </w:rPr>
+        <w:t xml:space="preserve">1. Emaitza eta analisiaren irismena</w:t>
+      </w:r>
+    </w:p>
+    <w:p>
+      <w:pPr>
+        <w:spacing w:after="140"/>
+      </w:pPr>
+      <w:r>
+        <w:rPr>
+          <w:rFonts w:ascii="Arial" w:hAnsi="Arial"/>
+          <w:sz w:val="22"/>
+          <w:lang w:val="eu-ES"/>
+        </w:rPr>
+        <w:t xml:space="preserve">SonarSource-ren instalatutako analizadoreekin exekutatutako emaitza: 147 incidientziatik 0ra. SonarQube for IDE 6.2.0.79823-ren motorra eta PHP, HTML eta CSS pluginak erabili dira, Sonar way profileko 286 araurekin: 176 PHP, 61 HTML eta 49 CSS. Hasierako kopiak 12 fitxategi zituen; amaierakoak 13, helpers.php gehitu delako. Ez da fitxategirik analisi-hutsagatik baztertu.</w:t>
+      </w:r>
+    </w:p>
+    <w:p>
+      <w:pPr>
+        <w:spacing w:after="140"/>
+      </w:pPr>
+      <w:r>
+        <w:rPr>
+          <w:rFonts w:ascii="Arial" w:hAnsi="Arial"/>
+          <w:sz w:val="22"/>
+          <w:lang w:val="eu-ES"/>
+        </w:rPr>
+        <w:t xml:space="preserve">Hasierako capturako 59 zenbakia editorean ikusitako egoerari zegokion. Oraingo 147 zenbakia webguneko PHP/HTML/CSS fitxategi guztien azterketarena da; beraz, bi zenbakiak ez dira irismen berekoak. index.php eta about.html aurreko urratsean zuzenduta zeuden; oraingo hondar gehienak includes karpetan zeuden.</w:t>
+      </w:r>
+    </w:p>
+    <w:p>
+      <w:pPr>
+        <w:spacing w:after="140"/>
+      </w:pPr>
+      <w:r>
+        <w:rPr>
+          <w:rFonts w:ascii="Arial" w:hAnsi="Arial"/>
+          <w:sz w:val="22"/>
+          <w:lang w:val="eu-ES"/>
+        </w:rPr>
+        <w:t xml:space="preserve">Ez da araurik desaktibatu eta ez da NOSONAR edo salbuespen-zerrendarik gehitu. Analisiak ez ditu Connected Mode-ko profil pertsonalizatuak edo beste hizkuntza eta azpiegiturak estaltzen. 0 incidientzia emaitzak ez du webgunearen segurtasun osoa ziurtatzen.</w:t>
+      </w:r>
+    </w:p>
+    <w:tbl>
+      <w:tblPr>
+        <w:tblW w:w="0" w:type="auto"/>
+        <w:tblBorders>
+          <w:top w:val="single" w:sz="4" w:color="AAAAAA"/>
+          <w:left w:val="single" w:sz="4" w:color="AAAAAA"/>
+          <w:bottom w:val="single" w:sz="4" w:color="AAAAAA"/>
+          <w:right w:val="single" w:sz="4" w:color="AAAAAA"/>
+          <w:insideH w:val="single" w:sz="4" w:color="AAAAAA"/>
+          <w:insideV w:val="single" w:sz="4" w:color="AAAAAA"/>
+        </w:tblBorders>
+      </w:tblPr>
+      <w:tr>
+        <w:trPr>
+          <w:tblHeader/>
+        </w:trPr>
+        <w:tc>
+          <w:tcPr>
+            <w:tcW w:w="0" w:type="auto"/>
+          </w:tcPr>
+          <w:p>
+            <w:r>
+              <w:rPr>
+                <w:rFonts w:ascii="Arial" w:hAnsi="Arial"/>
+                <w:sz w:val="20"/>
+                <w:b/>
+              </w:rPr>
+              <w:t>Araua</w:t>
+            </w:r>
+          </w:p>
+        </w:tc>
+        <w:tc>
+          <w:tcPr>
+            <w:tcW w:w="0" w:type="auto"/>
+          </w:tcPr>
+          <w:p>
+            <w:r>
+              <w:rPr>
+                <w:rFonts w:ascii="Arial" w:hAnsi="Arial"/>
+                <w:sz w:val="20"/>
+                <w:b/>
+              </w:rPr>
+              <w:t>Aurretik</w:t>
+            </w:r>
+          </w:p>
+        </w:tc>
+        <w:tc>
+          <w:tcPr>
+            <w:tcW w:w="0" w:type="auto"/>
+          </w:tcPr>
+          <w:p>
+            <w:r>
+              <w:rPr>
+                <w:rFonts w:ascii="Arial" w:hAnsi="Arial"/>
+                <w:sz w:val="20"/>
+                <w:b/>
+              </w:rPr>
+              <w:t>Ondoren</w:t>
+            </w:r>
+          </w:p>
+        </w:tc>
+      </w:tr>
+      <w:tr>
+        <w:tc>
+          <w:tcPr>
+            <w:tcW w:w="0" w:type="auto"/>
+          </w:tcPr>
+          <w:p>
+            <w:r>
+              <w:rPr>
+                <w:rFonts w:ascii="Arial" w:hAnsi="Arial"/>
+                <w:sz w:val="20"/>
+              </w:rPr>
+              <w:t>Web:S1827</w:t>
+            </w:r>
+          </w:p>
+        </w:tc>
+        <w:tc>
+          <w:tcPr>
+            <w:tcW w:w="0" w:type="auto"/>
+          </w:tcPr>
+          <w:p>
+            <w:r>
+              <w:rPr>
+                <w:rFonts w:ascii="Arial" w:hAnsi="Arial"/>
+                <w:sz w:val="20"/>
+              </w:rPr>
+              <w:t>59</w:t>
+            </w:r>
+          </w:p>
+        </w:tc>
+        <w:tc>
+          <w:tcPr>
+            <w:tcW w:w="0" w:type="auto"/>
+          </w:tcPr>
+          <w:p>
+            <w:r>
+              <w:rPr>
+                <w:rFonts w:ascii="Arial" w:hAnsi="Arial"/>
+                <w:sz w:val="20"/>
+              </w:rPr>
+              <w:t>0</w:t>
+            </w:r>
+          </w:p>
+        </w:tc>
+      </w:tr>
+      <w:tr>
+        <w:tc>
+          <w:tcPr>
+            <w:tcW w:w="0" w:type="auto"/>
+          </w:tcPr>
+          <w:p>
+            <w:r>
+              <w:rPr>
+                <w:rFonts w:ascii="Arial" w:hAnsi="Arial"/>
+                <w:sz w:val="20"/>
+              </w:rPr>
+              <w:t>Web:S5256</w:t>
+            </w:r>
+          </w:p>
+        </w:tc>
+        <w:tc>
+          <w:tcPr>
+            <w:tcW w:w="0" w:type="auto"/>
+          </w:tcPr>
+          <w:p>
+            <w:r>
+              <w:rPr>
+                <w:rFonts w:ascii="Arial" w:hAnsi="Arial"/>
+                <w:sz w:val="20"/>
+              </w:rPr>
+              <w:t>7</w:t>
+            </w:r>
+          </w:p>
+        </w:tc>
+        <w:tc>
+          <w:tcPr>
+            <w:tcW w:w="0" w:type="auto"/>
+          </w:tcPr>
+          <w:p>
+            <w:r>
+              <w:rPr>
+                <w:rFonts w:ascii="Arial" w:hAnsi="Arial"/>
+                <w:sz w:val="20"/>
+              </w:rPr>
+              <w:t>0</w:t>
+            </w:r>
+          </w:p>
+        </w:tc>
+      </w:tr>
+      <w:tr>
+        <w:tc>
+          <w:tcPr>
+            <w:tcW w:w="0" w:type="auto"/>
+          </w:tcPr>
+          <w:p>
+            <w:r>
+              <w:rPr>
+                <w:rFonts w:ascii="Arial" w:hAnsi="Arial"/>
+                <w:sz w:val="20"/>
+              </w:rPr>
+              <w:t>Web:InputWithoutLabelCheck</w:t>
+            </w:r>
+          </w:p>
+        </w:tc>
+        <w:tc>
+          <w:tcPr>
+            <w:tcW w:w="0" w:type="auto"/>
+          </w:tcPr>
+          <w:p>
+            <w:r>
+              <w:rPr>
+                <w:rFonts w:ascii="Arial" w:hAnsi="Arial"/>
+                <w:sz w:val="20"/>
+              </w:rPr>
+              <w:t>25</w:t>
+            </w:r>
+          </w:p>
+        </w:tc>
+        <w:tc>
+          <w:tcPr>
+            <w:tcW w:w="0" w:type="auto"/>
+          </w:tcPr>
+          <w:p>
+            <w:r>
+              <w:rPr>
+                <w:rFonts w:ascii="Arial" w:hAnsi="Arial"/>
+                <w:sz w:val="20"/>
+              </w:rPr>
+              <w:t>0</w:t>
+            </w:r>
+          </w:p>
+        </w:tc>
+      </w:tr>
+      <w:tr>
+        <w:tc>
+          <w:tcPr>
+            <w:tcW w:w="0" w:type="auto"/>
+          </w:tcPr>
+          <w:p>
+            <w:r>
+              <w:rPr>
+                <w:rFonts w:ascii="Arial" w:hAnsi="Arial"/>
+                <w:sz w:val="20"/>
+              </w:rPr>
+              <w:t>Web:ImgWithoutAltCheck</w:t>
+            </w:r>
+          </w:p>
+        </w:tc>
+        <w:tc>
+          <w:tcPr>
+            <w:tcW w:w="0" w:type="auto"/>
+          </w:tcPr>
+          <w:p>
+            <w:r>
+              <w:rPr>
+                <w:rFonts w:ascii="Arial" w:hAnsi="Arial"/>
+                <w:sz w:val="20"/>
+              </w:rPr>
+              <w:t>4</w:t>
+            </w:r>
+          </w:p>
+        </w:tc>
+        <w:tc>
+          <w:tcPr>
+            <w:tcW w:w="0" w:type="auto"/>
+          </w:tcPr>
+          <w:p>
+            <w:r>
+              <w:rPr>
+                <w:rFonts w:ascii="Arial" w:hAnsi="Arial"/>
+                <w:sz w:val="20"/>
+              </w:rPr>
+              <w:t>0</w:t>
+            </w:r>
+          </w:p>
+        </w:tc>
+      </w:tr>
+      <w:tr>
+        <w:tc>
+          <w:tcPr>
+            <w:tcW w:w="0" w:type="auto"/>
+          </w:tcPr>
+          <w:p>
+            <w:r>
+              <w:rPr>
+                <w:rFonts w:ascii="Arial" w:hAnsi="Arial"/>
+                <w:sz w:val="20"/>
+              </w:rPr>
+              <w:t>Web:S6853</w:t>
+            </w:r>
+          </w:p>
+        </w:tc>
+        <w:tc>
+          <w:tcPr>
+            <w:tcW w:w="0" w:type="auto"/>
+          </w:tcPr>
+          <w:p>
+            <w:r>
+              <w:rPr>
+                <w:rFonts w:ascii="Arial" w:hAnsi="Arial"/>
+                <w:sz w:val="20"/>
+              </w:rPr>
+              <w:t>11</w:t>
+            </w:r>
+          </w:p>
+        </w:tc>
+        <w:tc>
+          <w:tcPr>
+            <w:tcW w:w="0" w:type="auto"/>
+          </w:tcPr>
+          <w:p>
+            <w:r>
+              <w:rPr>
+                <w:rFonts w:ascii="Arial" w:hAnsi="Arial"/>
+                <w:sz w:val="20"/>
+              </w:rPr>
+              <w:t>0</w:t>
+            </w:r>
+          </w:p>
+        </w:tc>
+      </w:tr>
+      <w:tr>
+        <w:tc>
+          <w:tcPr>
+            <w:tcW w:w="0" w:type="auto"/>
+          </w:tcPr>
+          <w:p>
+            <w:r>
+              <w:rPr>
+                <w:rFonts w:ascii="Arial" w:hAnsi="Arial"/>
+                <w:sz w:val="20"/>
+              </w:rPr>
+              <w:t>php:S1780</w:t>
+            </w:r>
+          </w:p>
+        </w:tc>
+        <w:tc>
+          <w:tcPr>
+            <w:tcW w:w="0" w:type="auto"/>
+          </w:tcPr>
+          <w:p>
+            <w:r>
+              <w:rPr>
+                <w:rFonts w:ascii="Arial" w:hAnsi="Arial"/>
+                <w:sz w:val="20"/>
+              </w:rPr>
+              <w:t>2</w:t>
+            </w:r>
+          </w:p>
+        </w:tc>
+        <w:tc>
+          <w:tcPr>
+            <w:tcW w:w="0" w:type="auto"/>
+          </w:tcPr>
+          <w:p>
+            <w:r>
+              <w:rPr>
+                <w:rFonts w:ascii="Arial" w:hAnsi="Arial"/>
+                <w:sz w:val="20"/>
+              </w:rPr>
+              <w:t>0</w:t>
+            </w:r>
+          </w:p>
+        </w:tc>
+      </w:tr>
+      <w:tr>
+        <w:tc>
+          <w:tcPr>
+            <w:tcW w:w="0" w:type="auto"/>
+          </w:tcPr>
+          <w:p>
+            <w:r>
+              <w:rPr>
+                <w:rFonts w:ascii="Arial" w:hAnsi="Arial"/>
+                <w:sz w:val="20"/>
+              </w:rPr>
+              <w:t>php:S113</w:t>
+            </w:r>
+          </w:p>
+        </w:tc>
+        <w:tc>
+          <w:tcPr>
+            <w:tcW w:w="0" w:type="auto"/>
+          </w:tcPr>
+          <w:p>
+            <w:r>
+              <w:rPr>
+                <w:rFonts w:ascii="Arial" w:hAnsi="Arial"/>
+                <w:sz w:val="20"/>
+              </w:rPr>
+              <w:t>6</w:t>
+            </w:r>
+          </w:p>
+        </w:tc>
+        <w:tc>
+          <w:tcPr>
+            <w:tcW w:w="0" w:type="auto"/>
+          </w:tcPr>
+          <w:p>
+            <w:r>
+              <w:rPr>
+                <w:rFonts w:ascii="Arial" w:hAnsi="Arial"/>
+                <w:sz w:val="20"/>
+              </w:rPr>
+              <w:t>0</w:t>
+            </w:r>
+          </w:p>
+        </w:tc>
+      </w:tr>
+      <w:tr>
+        <w:tc>
+          <w:tcPr>
+            <w:tcW w:w="0" w:type="auto"/>
+          </w:tcPr>
+          <w:p>
+            <w:r>
+              <w:rPr>
+                <w:rFonts w:ascii="Arial" w:hAnsi="Arial"/>
+                <w:sz w:val="20"/>
+              </w:rPr>
+              <w:t>php:S2077</w:t>
+            </w:r>
+          </w:p>
+        </w:tc>
+        <w:tc>
+          <w:tcPr>
+            <w:tcW w:w="0" w:type="auto"/>
+          </w:tcPr>
+          <w:p>
+            <w:r>
+              <w:rPr>
+                <w:rFonts w:ascii="Arial" w:hAnsi="Arial"/>
+                <w:sz w:val="20"/>
+              </w:rPr>
+              <w:t>13</w:t>
+            </w:r>
+          </w:p>
+        </w:tc>
+        <w:tc>
+          <w:tcPr>
+            <w:tcW w:w="0" w:type="auto"/>
+          </w:tcPr>
+          <w:p>
+            <w:r>
+              <w:rPr>
+                <w:rFonts w:ascii="Arial" w:hAnsi="Arial"/>
+                <w:sz w:val="20"/>
+              </w:rPr>
+              <w:t>0</w:t>
+            </w:r>
+          </w:p>
+        </w:tc>
+      </w:tr>
+      <w:tr>
+        <w:tc>
+          <w:tcPr>
+            <w:tcW w:w="0" w:type="auto"/>
+          </w:tcPr>
+          <w:p>
+            <w:r>
+              <w:rPr>
+                <w:rFonts w:ascii="Arial" w:hAnsi="Arial"/>
+                <w:sz w:val="20"/>
+              </w:rPr>
+              <w:t>php:S1192</w:t>
+            </w:r>
+          </w:p>
+        </w:tc>
+        <w:tc>
+          <w:tcPr>
+            <w:tcW w:w="0" w:type="auto"/>
+          </w:tcPr>
+          <w:p>
+            <w:r>
+              <w:rPr>
+                <w:rFonts w:ascii="Arial" w:hAnsi="Arial"/>
+                <w:sz w:val="20"/>
+              </w:rPr>
+              <w:t>3</w:t>
+            </w:r>
+          </w:p>
+        </w:tc>
+        <w:tc>
+          <w:tcPr>
+            <w:tcW w:w="0" w:type="auto"/>
+          </w:tcPr>
+          <w:p>
+            <w:r>
+              <w:rPr>
+                <w:rFonts w:ascii="Arial" w:hAnsi="Arial"/>
+                <w:sz w:val="20"/>
+              </w:rPr>
+              <w:t>0</w:t>
+            </w:r>
+          </w:p>
+        </w:tc>
+      </w:tr>
+      <w:tr>
+        <w:tc>
+          <w:tcPr>
+            <w:tcW w:w="0" w:type="auto"/>
+          </w:tcPr>
+          <w:p>
+            <w:r>
+              <w:rPr>
+                <w:rFonts w:ascii="Arial" w:hAnsi="Arial"/>
+                <w:sz w:val="20"/>
+              </w:rPr>
+              <w:t>php:S4790</w:t>
+            </w:r>
+          </w:p>
+        </w:tc>
+        <w:tc>
+          <w:tcPr>
+            <w:tcW w:w="0" w:type="auto"/>
+          </w:tcPr>
+          <w:p>
+            <w:r>
+              <w:rPr>
+                <w:rFonts w:ascii="Arial" w:hAnsi="Arial"/>
+                <w:sz w:val="20"/>
+              </w:rPr>
+              <w:t>4</w:t>
+            </w:r>
+          </w:p>
+        </w:tc>
+        <w:tc>
+          <w:tcPr>
+            <w:tcW w:w="0" w:type="auto"/>
+          </w:tcPr>
+          <w:p>
+            <w:r>
+              <w:rPr>
+                <w:rFonts w:ascii="Arial" w:hAnsi="Arial"/>
+                <w:sz w:val="20"/>
+              </w:rPr>
+              <w:t>0</w:t>
+            </w:r>
+          </w:p>
+        </w:tc>
+      </w:tr>
+      <w:tr>
+        <w:tc>
+          <w:tcPr>
+            <w:tcW w:w="0" w:type="auto"/>
+          </w:tcPr>
+          <w:p>
+            <w:r>
+              <w:rPr>
+                <w:rFonts w:ascii="Arial" w:hAnsi="Arial"/>
+                <w:sz w:val="20"/>
+              </w:rPr>
+              <w:t>php:S125</w:t>
+            </w:r>
+          </w:p>
+        </w:tc>
+        <w:tc>
+          <w:tcPr>
+            <w:tcW w:w="0" w:type="auto"/>
+          </w:tcPr>
+          <w:p>
+            <w:r>
+              <w:rPr>
+                <w:rFonts w:ascii="Arial" w:hAnsi="Arial"/>
+                <w:sz w:val="20"/>
+              </w:rPr>
+              <w:t>1</w:t>
+            </w:r>
+          </w:p>
+        </w:tc>
+        <w:tc>
+          <w:tcPr>
+            <w:tcW w:w="0" w:type="auto"/>
+          </w:tcPr>
+          <w:p>
+            <w:r>
+              <w:rPr>
+                <w:rFonts w:ascii="Arial" w:hAnsi="Arial"/>
+                <w:sz w:val="20"/>
+              </w:rPr>
+              <w:t>0</w:t>
+            </w:r>
+          </w:p>
+        </w:tc>
+      </w:tr>
+      <w:tr>
+        <w:tc>
+          <w:tcPr>
+            <w:tcW w:w="0" w:type="auto"/>
+          </w:tcPr>
+          <w:p>
+            <w:r>
+              <w:rPr>
+                <w:rFonts w:ascii="Arial" w:hAnsi="Arial"/>
+                <w:sz w:val="20"/>
+              </w:rPr>
+              <w:t>php:S105</w:t>
+            </w:r>
+          </w:p>
+        </w:tc>
+        <w:tc>
+          <w:tcPr>
+            <w:tcW w:w="0" w:type="auto"/>
+          </w:tcPr>
+          <w:p>
+            <w:r>
+              <w:rPr>
+                <w:rFonts w:ascii="Arial" w:hAnsi="Arial"/>
+                <w:sz w:val="20"/>
+              </w:rPr>
+              <w:t>2</w:t>
+            </w:r>
+          </w:p>
+        </w:tc>
+        <w:tc>
+          <w:tcPr>
+            <w:tcW w:w="0" w:type="auto"/>
+          </w:tcPr>
+          <w:p>
+            <w:r>
+              <w:rPr>
+                <w:rFonts w:ascii="Arial" w:hAnsi="Arial"/>
+                <w:sz w:val="20"/>
+              </w:rPr>
+              <w:t>0</w:t>
+            </w:r>
+          </w:p>
+        </w:tc>
+      </w:tr>
+      <w:tr>
+        <w:tc>
+          <w:tcPr>
+            <w:tcW w:w="0" w:type="auto"/>
+          </w:tcPr>
+          <w:p>
+            <w:r>
+              <w:rPr>
+                <w:rFonts w:ascii="Arial" w:hAnsi="Arial"/>
+                <w:sz w:val="20"/>
+              </w:rPr>
+              <w:t>php:S1155</w:t>
+            </w:r>
+          </w:p>
+        </w:tc>
+        <w:tc>
+          <w:tcPr>
+            <w:tcW w:w="0" w:type="auto"/>
+          </w:tcPr>
+          <w:p>
+            <w:r>
+              <w:rPr>
+                <w:rFonts w:ascii="Arial" w:hAnsi="Arial"/>
+                <w:sz w:val="20"/>
+              </w:rPr>
+              <w:t>1</w:t>
+            </w:r>
+          </w:p>
+        </w:tc>
+        <w:tc>
+          <w:tcPr>
+            <w:tcW w:w="0" w:type="auto"/>
+          </w:tcPr>
+          <w:p>
+            <w:r>
+              <w:rPr>
+                <w:rFonts w:ascii="Arial" w:hAnsi="Arial"/>
+                <w:sz w:val="20"/>
+              </w:rPr>
+              <w:t>0</w:t>
+            </w:r>
+          </w:p>
+        </w:tc>
+      </w:tr>
+      <w:tr>
+        <w:tc>
+          <w:tcPr>
+            <w:tcW w:w="0" w:type="auto"/>
+          </w:tcPr>
+          <w:p>
+            <w:r>
+              <w:rPr>
+                <w:rFonts w:ascii="Arial" w:hAnsi="Arial"/>
+                <w:sz w:val="20"/>
+              </w:rPr>
+              <w:t>php:S121</w:t>
+            </w:r>
+          </w:p>
+        </w:tc>
+        <w:tc>
+          <w:tcPr>
+            <w:tcW w:w="0" w:type="auto"/>
+          </w:tcPr>
+          <w:p>
+            <w:r>
+              <w:rPr>
+                <w:rFonts w:ascii="Arial" w:hAnsi="Arial"/>
+                <w:sz w:val="20"/>
+              </w:rPr>
+              <w:t>9</w:t>
+            </w:r>
+          </w:p>
+        </w:tc>
+        <w:tc>
+          <w:tcPr>
+            <w:tcW w:w="0" w:type="auto"/>
+          </w:tcPr>
+          <w:p>
+            <w:r>
+              <w:rPr>
+                <w:rFonts w:ascii="Arial" w:hAnsi="Arial"/>
+                <w:sz w:val="20"/>
+              </w:rPr>
+              <w:t>0</w:t>
+            </w:r>
+          </w:p>
+        </w:tc>
+      </w:tr>
+    </w:tbl>
+    <w:p>
+      <w:pPr>
+        <w:spacing w:after="140"/>
+        <w:keepNext/>
+        <w:outlineLvl w:val="1"/>
+      </w:pPr>
+      <w:r>
+        <w:rPr>
+          <w:rFonts w:ascii="Arial" w:hAnsi="Arial"/>
+          <w:sz w:val="27"/>
+          <w:lang w:val="eu-ES"/>
+          <w:b/>
+        </w:rPr>
+        <w:t xml:space="preserve">2. HTML eta irisgarritasunaren zuzenketak</w:t>
+      </w:r>
+    </w:p>
+    <w:p>
+      <w:pPr>
+        <w:spacing w:after="140"/>
+      </w:pPr>
+      <w:r>
+        <w:rPr>
+          <w:rFonts w:ascii="Arial" w:hAnsi="Arial"/>
+          <w:sz w:val="22"/>
+          <w:lang w:val="eu-ES"/>
+        </w:rPr>
+        <w:t xml:space="preserve">account.php, description.php, login.php, main.php, register.php eta updel.php fitxategietan align, valign, width, cellpadding, cellspacing eta border atributu zaharkituak kendu dira. Aurkezpen-taulak div/article eta CSS bidez antolatu dira. Erabiltzaileen benetako datu-taulak caption eta scope="col" duten th goiburuak ditu.</w:t>
+      </w:r>
+    </w:p>
+    <w:p>
+      <w:pPr>
+        <w:spacing w:after="140"/>
+      </w:pPr>
+      <w:r>
+        <w:rPr>
+          <w:rFonts w:ascii="Arial" w:hAnsi="Arial"/>
+          <w:sz w:val="22"/>
+          <w:lang w:val="eu-ES"/>
+        </w:rPr>
+        <w:t xml:space="preserve">Input eta textarea eremu guztiek id bakarra eta dagokion label for lotura dute. Irudiek alt testua dute. Erregistroko reset kontrola button bihurtu da. CSS klaseek formularioak, katalogoa, irudiak eta kontuaren diseinua egokitzen dituzte.</w:t>
+      </w:r>
+    </w:p>
+    <w:p>
+      <w:pPr>
+        <w:spacing w:after="140"/>
+        <w:keepNext/>
+        <w:outlineLvl w:val="1"/>
+      </w:pPr>
+      <w:r>
+        <w:rPr>
+          <w:rFonts w:ascii="Arial" w:hAnsi="Arial"/>
+          <w:sz w:val="27"/>
+          <w:lang w:val="eu-ES"/>
+          <w:b/>
+        </w:rPr>
+        <w:t xml:space="preserve">3. PHP mantentzea eta erroreen kudeaketa</w:t>
+      </w:r>
+    </w:p>
+    <w:p>
+      <w:pPr>
+        <w:spacing w:after="140"/>
+      </w:pPr>
+      <w:r>
+        <w:rPr>
+          <w:rFonts w:ascii="Arial" w:hAnsi="Arial"/>
+          <w:sz w:val="22"/>
+          <w:lang w:val="eu-ES"/>
+        </w:rPr>
+        <w:t xml:space="preserve">PHP hutseko fitxategietako amaierako ?&gt; etiketak kendu dira; falta ziren azken lerro-jauziak gehitu dira, tabulazioak ordezkatu eta egitura baldintzatuak giltzekin idatzi dira. Bikoiztutako redirekzioak, HTML kodetzea eta sarbide-egiaztapenak helpers.php fitxategiko funtzioetan bildu dira. Upload erroreek ImageUploadException salbuespen espezifikoa dute.</w:t>
+      </w:r>
+    </w:p>
+    <w:p>
+      <w:pPr>
+        <w:spacing w:after="140"/>
+      </w:pPr>
+      <w:r>
+        <w:rPr>
+          <w:rFonts w:ascii="Arial" w:hAnsi="Arial"/>
+          <w:sz w:val="22"/>
+          <w:lang w:val="eu-ES"/>
+        </w:rPr>
+        <w:t xml:space="preserve">main_orig.php fitxategiak katalogoaren ikuspegi mantendua erabiltzen du orain; jatorrizko kodea Git historian eta build/sonar/source-before kopian dago. Horrela, ez da ahuleziak dituen bigarren katalogo bat mantentzen zerbitzatutako karpetan.</w:t>
+      </w:r>
+    </w:p>
+    <w:p>
+      <w:pPr>
+        <w:spacing w:after="140"/>
+      </w:pPr>
+      <w:r>
+        <w:rPr>
+          <w:rFonts w:ascii="Arial" w:hAnsi="Arial"/>
+          <w:sz w:val="22"/>
+          <w:lang w:val="eu-ES"/>
+        </w:rPr>
+        <w:t xml:space="preserve">mysql.php fitxategiak mysqli salbuespenak eta utf8mb4 konexioa konfiguratzen ditu. register.php-ko mysqli_error() dei okerra desagertu denez, PHPStan baselinea hustu da; oraingo analisiak ez du aurreko akatsa ezkutatzen.</w:t>
+      </w:r>
+    </w:p>
+    <w:p>
+      <w:pPr>
+        <w:spacing w:after="140"/>
+        <w:keepNext/>
+        <w:outlineLvl w:val="1"/>
+      </w:pPr>
+      <w:r>
+        <w:rPr>
+          <w:rFonts w:ascii="Arial" w:hAnsi="Arial"/>
+          <w:sz w:val="27"/>
+          <w:lang w:val="eu-ES"/>
+          <w:b/>
+        </w:rPr>
+        <w:t xml:space="preserve">4. SQL kontsultak eta XSS irteerak</w:t>
+      </w:r>
+    </w:p>
+    <w:p>
+      <w:pPr>
+        <w:spacing w:after="140"/>
+      </w:pPr>
+      <w:r>
+        <w:rPr>
+          <w:rFonts w:ascii="Arial" w:hAnsi="Arial"/>
+          <w:sz w:val="22"/>
+          <w:lang w:val="eu-ES"/>
+        </w:rPr>
+        <w:t xml:space="preserve">Eskaeretako datuekin eraikitako kontsulta dinamikoak kontsulta prestatuekin ordezkatu dira, mysqli_prepare eta mysqli_stmt_bind_param erabiliz. SELECT, INSERT, UPDATE eta DELETE eragiketetan erabiltzaile-datuak parametro gisa bidaltzen dira. main_orig.php-ko kontsulta bikoiztua kendu da ikuspegi komunera bideratzean.</w:t>
+      </w:r>
+    </w:p>
+    <w:p>
+      <w:pPr>
+        <w:spacing w:after="140"/>
+        <w:shd w:fill="F2F2F2"/>
+      </w:pPr>
+      <w:r>
+        <w:rPr>
+          <w:rFonts w:ascii="Consolas" w:hAnsi="Consolas"/>
+          <w:sz w:val="18"/>
+          <w:lang w:val="eu-ES"/>
+        </w:rPr>
+        <w:t xml:space="preserve">Aurretik: erabiltzaile-izena edo bilaketa-testua SQL kateari zuzenean eransten zitzaion.</w:t>
+      </w:r>
+    </w:p>
+    <w:p>
+      <w:pPr>
+        <w:spacing w:after="140"/>
+        <w:shd w:fill="F2F2F2"/>
+      </w:pPr>
+      <w:r>
+        <w:rPr>
+          <w:rFonts w:ascii="Consolas" w:hAnsi="Consolas"/>
+          <w:sz w:val="18"/>
+          <w:lang w:val="eu-ES"/>
+        </w:rPr>
+        <w:t xml:space="preserve">Ondoren: SELECT username, password FROM users WHERE username = ? LIMIT 1</w:t>
+      </w:r>
+    </w:p>
+    <w:p>
+      <w:pPr>
+        <w:spacing w:after="140"/>
+      </w:pPr>
+      <w:r>
+        <w:rPr>
+          <w:rFonts w:ascii="Arial" w:hAnsi="Arial"/>
+          <w:sz w:val="22"/>
+          <w:lang w:val="eu-ES"/>
+        </w:rPr>
+        <w:t xml:space="preserve">Zuzendu aurreko HTTP proban, komatxoak eta OR baldintza zituen laborategiko saio-hasiera batek administratzailearen saioa irekitzen zuen. Zuzenketaren ondoren, sarrera bera baztertzen da. Bilaketako SQLi probak ez du katalogoa itzultzen. Bilaketaren eta gordetako produktu-deskripzioaren HTML/script etiketak testu kodetu gisa erakusten dira.</w:t>
+      </w:r>
+    </w:p>
+    <w:p>
+      <w:pPr>
+        <w:spacing w:after="140"/>
+        <w:keepNext/>
+        <w:outlineLvl w:val="1"/>
+      </w:pPr>
+      <w:r>
+        <w:rPr>
+          <w:rFonts w:ascii="Arial" w:hAnsi="Arial"/>
+          <w:sz w:val="27"/>
+          <w:lang w:val="eu-ES"/>
+          <w:b/>
+        </w:rPr>
+        <w:t xml:space="preserve">5. Pasahitzak eta lehendik zeuden kontuak</w:t>
+      </w:r>
+    </w:p>
+    <w:p>
+      <w:pPr>
+        <w:spacing w:after="140"/>
+      </w:pPr>
+      <w:r>
+        <w:rPr>
+          <w:rFonts w:ascii="Arial" w:hAnsi="Arial"/>
+          <w:sz w:val="22"/>
+          <w:lang w:val="eu-ES"/>
+        </w:rPr>
+        <w:t xml:space="preserve">MD5 ordezkatu da: alta eta pasahitz-aldaketetan password_hash(PASSWORD_DEFAULT) erabiltzen da eta saio-hasieran password_verify. Pasahitza aldatzean saioa duen erabiltzailearen username zehatza eguneratzen da; aurreko kodeak pasahitz bera zuten beste kontuak ere alda zitzakeen. Saio-hasiera zuzenean session_regenerate_id(true) egiten da eta hash-a ez da saioan gordetzen.</w:t>
+      </w:r>
+    </w:p>
+    <w:p>
+      <w:pPr>
+        <w:spacing w:after="140"/>
+      </w:pPr>
+      <w:r>
+        <w:rPr>
+          <w:rFonts w:ascii="Arial" w:hAnsi="Arial"/>
+          <w:sz w:val="22"/>
+          <w:lang w:val="eu-ES"/>
+        </w:rPr>
+        <w:t xml:space="preserve">Datu-basearen kopia egin da migrazioaren aurretik: build/sonar/database-before.sql. Egiaztatu da bi kontuek laborategiko hash zahar ezaguna zutela; hash indartsuetara migratu dira, erabiltzaileen pasahitzak aldatu gabe. password zutabea VARCHAR(255) bihurtu da. bdweb.sql instalazio-fitxategia ere eguneratu da, instalazio berriek formatu bateragarria izan dezaten.</w:t>
+      </w:r>
+    </w:p>
+    <w:p>
+      <w:pPr>
+        <w:spacing w:after="140"/>
+      </w:pPr>
+      <w:r>
+        <w:rPr>
+          <w:rFonts w:ascii="Arial" w:hAnsi="Arial"/>
+          <w:sz w:val="22"/>
+          <w:lang w:val="eu-ES"/>
+        </w:rPr>
+        <w:t xml:space="preserve">tools/migrate-demo-passwords.php tresna laborategiko hash ezagun horretarako bakarrik da. Lehenetsita egoera erakusten du eta ez du daturik aldatzen; --apply aukerak migrazioa aplikatzen du. Hash zahar ezezagunak aurkituz gero, berrezarpen-plan bat behar da; tresnak ez ditu asmatzen. Uneko datu-basean ez dago migratzeko konturik edo 32 karaktereko hash zaharrik.</w:t>
+      </w:r>
+    </w:p>
+    <w:p>
+      <w:pPr>
+        <w:spacing w:after="140"/>
+        <w:keepNext/>
+        <w:outlineLvl w:val="1"/>
+      </w:pPr>
+      <w:r>
+        <w:rPr>
+          <w:rFonts w:ascii="Arial" w:hAnsi="Arial"/>
+          <w:sz w:val="27"/>
+          <w:lang w:val="eu-ES"/>
+          <w:b/>
+        </w:rPr>
+        <w:t xml:space="preserve">6. Baimenak eta fitxategiak</w:t>
+      </w:r>
+    </w:p>
+    <w:p>
+      <w:pPr>
+        <w:spacing w:after="140"/>
+      </w:pPr>
+      <w:r>
+        <w:rPr>
+          <w:rFonts w:ascii="Arial" w:hAnsi="Arial"/>
+          <w:sz w:val="22"/>
+          <w:lang w:val="eu-ES"/>
+        </w:rPr>
+        <w:t xml:space="preserve">Kontuaren eta administrazioaren egiaztapenak ikuspegietan ere aplikatzen dira. Produktuen aldaketak administratzaileari mugatu zaizkio. Produktu eta erabiltzaileen ezabaketek POST eskaera behar dute. Irudien igoeran MIME mota, 2 MB-ko muga eta ausazko fitxategi-izena erabiltzen dira. Katalogoko irudi partekatu originalak ez dira produktu bat ezabatzean kentzen.</w:t>
+      </w:r>
+    </w:p>
+    <w:p>
+      <w:pPr>
+        <w:spacing w:after="140"/>
+        <w:keepNext/>
+        <w:outlineLvl w:val="1"/>
+      </w:pPr>
+      <w:r>
+        <w:rPr>
+          <w:rFonts w:ascii="Arial" w:hAnsi="Arial"/>
+          <w:sz w:val="27"/>
+          <w:lang w:val="eu-ES"/>
+          <w:b/>
+        </w:rPr>
+        <w:t xml:space="preserve">7. Probak eta probetan aurkitutako beste akatsa</w:t>
+      </w:r>
+    </w:p>
+    <w:p>
+      <w:pPr>
+        <w:spacing w:after="140"/>
+      </w:pPr>
+      <w:r>
+        <w:rPr>
+          <w:rFonts w:ascii="Arial" w:hAnsi="Arial"/>
+          <w:sz w:val="22"/>
+          <w:lang w:val="eu-ES"/>
+        </w:rPr>
+        <w:t xml:space="preserve">89 HTTP egiaztapen gainditu dira: benetako bi kontuen bateragarritasuna, login SQLi errefusa, bilaketa SQLi errefusa, XSS irteera-kodetzea, alta, pasahitz-aldaketa, baimenak, administratzailearen erabiltzaile-alta, irudi baten igoera, produktu-alta/aldaketa/ezabaketa, 400/404 kasuak, formularioen label loturak eta saio-amaiera. Aldi baterako erregistro guztiak kendu dira. Amaieran jatorrizko 2 erabiltzaile eta 3 produktu geratu dira.</w:t>
+      </w:r>
+    </w:p>
+    <w:p>
+      <w:pPr>
+        <w:spacing w:after="140"/>
+      </w:pPr>
+      <w:r>
+        <w:rPr>
+          <w:rFonts w:ascii="Arial" w:hAnsi="Arial"/>
+          <w:sz w:val="22"/>
+          <w:lang w:val="eu-ES"/>
+        </w:rPr>
+        <w:t xml:space="preserve">Probak erabiltzaile-izen luze baten mozketa isila detektatu zuen: username zutabeak 30 karaktereko muga du. Zerbitzarian luzera egiaztatzen da orain eta formularioak maxlength="30" adierazten du. Testean sortutako erregistro moztua identifikatu eta kendu da; proba berriro exekutatuta gainditu da.</w:t>
+      </w:r>
+    </w:p>
+    <w:p>
+      <w:pPr>
+        <w:spacing w:after="140"/>
+      </w:pPr>
+      <w:r>
+        <w:rPr>
+          <w:rFonts w:ascii="Arial" w:hAnsi="Arial"/>
+          <w:sz w:val="22"/>
+          <w:lang w:val="eu-ES"/>
+        </w:rPr>
+        <w:t xml:space="preserve">composer check ere gainditu da: sintaxia, PHPStan eta 5 PHPUnit proba / 15 baieztapen. Unitate-probak HTML berriko atributu komatxodunetara egokitu dira. Testen xehetasunak http-probak.json fitxategian daude.</w:t>
+      </w:r>
+    </w:p>
+    <w:p>
+      <w:pPr>
+        <w:spacing w:after="140"/>
+        <w:keepNext/>
+        <w:outlineLvl w:val="1"/>
+      </w:pPr>
+      <w:r>
+        <w:rPr>
+          <w:rFonts w:ascii="Arial" w:hAnsi="Arial"/>
+          <w:sz w:val="27"/>
+          <w:lang w:val="eu-ES"/>
+          <w:b/>
+        </w:rPr>
+        <w:t xml:space="preserve">8. Erreprodukzioa, ebidentziak eta mugak</w:t>
+      </w:r>
+    </w:p>
+    <w:p>
+      <w:pPr>
+        <w:spacing w:after="140"/>
+      </w:pPr>
+      <w:r>
+        <w:rPr>
+          <w:rFonts w:ascii="Arial" w:hAnsi="Arial"/>
+          <w:sz w:val="22"/>
+          <w:lang w:val="eu-ES"/>
+        </w:rPr>
+        <w:t xml:space="preserve">Analizatzailea berriz exekutatzeko kodea tools/sonar/RunSonar.java fitxategian dago. Instalatutako sonarlint-ls.jar classpath-ean eta pluginen karpeta argumentu gisa erabiltzen ditu; emaitza issues.json fitxategian gordetzen du. Bertsio zehatz horren barneko APIa erabiltzen du, eta beste bertsio batekin egokitzapena behar izan dezake. Ez ditu erabiltzailearen VS Code ezarpenak aldatzen.</w:t>
+      </w:r>
+    </w:p>
+    <w:p>
+      <w:pPr>
+        <w:spacing w:after="140"/>
+      </w:pPr>
+      <w:r>
+        <w:rPr>
+          <w:rFonts w:ascii="Arial" w:hAnsi="Arial"/>
+          <w:sz w:val="22"/>
+          <w:lang w:val="eu-ES"/>
+        </w:rPr>
+        <w:t xml:space="preserve">Ebidentziak: docs/auditoria/ebidentziak/SONAR-002/ karpetako aurretik.json, ondoren.json, laburpena.json, http-probak.json eta aurreko-sqli-proba.json. laburpena.json fitxategiak pluginen bertsio-manifestuak eta SHA-256 balioak jasotzen ditu. txostena.html eta haren captura benetako JSON horietatik sortu dira; ez dira VS Code-ko Problems panelaren captura.</w:t>
+      </w:r>
+    </w:p>
+    <w:p>
+      <w:pPr>
+        <w:spacing w:after="140"/>
+      </w:pPr>
+      <w:r>
+        <w:rPr>
+          <w:rFonts w:ascii="Arial" w:hAnsi="Arial"/>
+          <w:sz w:val="22"/>
+          <w:lang w:val="eu-ES"/>
+        </w:rPr>
+        <w:t xml:space="preserve">Analisiak erronka2_web karpetako 13 PHP/HTML/CSS fitxategiak estaltzen ditu. Infraestruktura, CSRF babes osoa, saioen politika osoa eta beste konfigurazio batzuetako portaera aparteko auditorian egiaztatu behar dira. Ez dira ataza horiek 0 incidientzia emaitzagatik automatikoki amaitutzat eman.</w:t>
+      </w:r>
+    </w:p>
+    <w:p>
+      <w:pPr>
+        <w:spacing w:after="140"/>
+      </w:pPr>
+      <w:r>
+        <w:rPr>
+          <w:rFonts w:ascii="Arial" w:hAnsi="Arial"/>
+          <w:sz w:val="22"/>
+          <w:lang w:val="eu-ES"/>
+        </w:rPr>
+        <w:t xml:space="preserve">Aldatutako fitxategiak: conf.php, includes karpetako ikuspegiak, style.css, tests/AuthenticationViewsTest.php, phpstan-baseline.neon, bdweb.sql eta Word dokumentua. Sortuak: helpers.php, tools/migrate-demo-passwords.php, tools/sonar/RunSonar.java eta SONAR-002 ebidentziak. Jatorrizko eduki dokumentala eta aurreko capturak gorde dira.</w:t>
+      </w:r>
+    </w:p>
+    <w:p>
+      <w:pPr>
+        <w:spacing w:after="140"/>
+      </w:pPr>
+      <w:r>
+        <w:rPr>
+          <w:rFonts w:ascii="Arial" w:hAnsi="Arial"/>
+          <w:sz w:val="22"/>
+          <w:lang w:val="eu-ES"/>
+        </w:rPr>
+        <w:t xml:space="preserve">Erreferentzia ofizialak: PHP prepared statements — https://www.php.net/manual/en/mysqli.quickstart.prepared-statements.php ; password_hash — https://www.php.net/manual/en/function.password-hash.php ; password_verify — https://www.php.net/manual/en/function.password-verify.php .</w:t>
+      </w:r>
+    </w:p>
+    <w:p>
+      <w:r>
+        <w:br w:type="page"/>
+      </w:r>
+    </w:p>
+    <w:p>
+      <w:pPr>
+        <w:spacing w:after="140"/>
+        <w:keepNext/>
+        <w:outlineLvl w:val="1"/>
+      </w:pPr>
+      <w:r>
+        <w:rPr>
+          <w:rFonts w:ascii="Arial" w:hAnsi="Arial"/>
+          <w:sz w:val="27"/>
+          <w:lang w:val="eu-ES"/>
+          <w:b/>
+        </w:rPr>
+        <w:t xml:space="preserve">SONAR-002: 147 → 0 analisiaren emaitza</w:t>
+      </w:r>
+    </w:p>
+    <w:p>
+      <w:pPr>
+        <w:spacing w:after="140"/>
+      </w:pPr>
+      <w:r>
+        <w:rPr>
+          <w:rFonts w:ascii="Arial" w:hAnsi="Arial"/>
+          <w:sz w:val="22"/>
+          <w:lang w:val="eu-ES"/>
+        </w:rPr>
+        <w:t xml:space="preserve">SonarSource-ren JSON txostenaren captura.</w:t>
+      </w:r>
+    </w:p>
+    <w:p>
+      <w:r>
+        <w:drawing>
+          <wp:inline distT="0" distB="0" distL="0" distR="0">
+            <wp:extent cx="5100000" cy="5100000"/>
+            <wp:docPr id="107" name="sonar002-txostena.png" descr="SONAR-002: 147 → 0 analisiaren emaitza"/>
+            <wp:cNvGraphicFramePr/>
+            <a:graphic xmlns:a="http://schemas.openxmlformats.org/drawingml/2006/main">
+              <a:graphicData uri="http://schemas.openxmlformats.org/drawingml/2006/picture">
+                <pic:pic xmlns:pic="http://schemas.openxmlformats.org/drawingml/2006/picture">
+                  <pic:nvPicPr>
+                    <pic:cNvPr id="0" name="sonar002-txostena.png"/>
+                    <pic:cNvPicPr/>
+                  </pic:nvPicPr>
+                  <pic:blipFill>
+                    <a:blip r:embed="rId15"/>
+                    <a:stretch>
+                      <a:fillRect/>
+                    </a:stretch>
+                  </pic:blipFill>
+                  <pic:spPr>
+                    <a:xfrm>
+                      <a:off x="0" y="0"/>
+                      <a:ext cx="5100000" cy="5100000"/>
+                    </a:xfrm>
+                    <a:prstGeom prst="rect">
+                      <a:avLst/>
+                    </a:prstGeom>
+                  </pic:spPr>
+                </pic:pic>
+              </a:graphicData>
+            </a:graphic>
+          </wp:inline>
+        </w:drawing>
+      </w:r>
+    </w:p>
+    <w:p>
+      <w:r>
+        <w:br w:type="page"/>
+      </w:r>
+    </w:p>
+    <w:p>
+      <w:pPr>
+        <w:spacing w:after="140"/>
+        <w:keepNext/>
+        <w:outlineLvl w:val="1"/>
+      </w:pPr>
+      <w:r>
+        <w:rPr>
+          <w:rFonts w:ascii="Arial" w:hAnsi="Arial"/>
+          <w:sz w:val="27"/>
+          <w:lang w:val="eu-ES"/>
+          <w:b/>
+        </w:rPr>
+        <w:t xml:space="preserve">Saio-hasierako formulario zuzendua</w:t>
+      </w:r>
+    </w:p>
+    <w:p>
+      <w:pPr>
+        <w:spacing w:after="140"/>
+      </w:pPr>
+      <w:r>
+        <w:rPr>
+          <w:rFonts w:ascii="Arial" w:hAnsi="Arial"/>
+          <w:sz w:val="22"/>
+          <w:lang w:val="eu-ES"/>
+        </w:rPr>
+        <w:t xml:space="preserve">Benetako tokiko webgunearen captura, HTTP bidez: 127.0.0.1:8081.</w:t>
+      </w:r>
+    </w:p>
+    <w:p>
+      <w:r>
+        <w:drawing>
+          <wp:inline distT="0" distB="0" distL="0" distR="0">
+            <wp:extent cx="5100000" cy="5100000"/>
+            <wp:docPr id="108" name="sonar002-login.png" descr="Saio-hasierako formulario zuzendua"/>
+            <wp:cNvGraphicFramePr/>
+            <a:graphic xmlns:a="http://schemas.openxmlformats.org/drawingml/2006/main">
+              <a:graphicData uri="http://schemas.openxmlformats.org/drawingml/2006/picture">
+                <pic:pic xmlns:pic="http://schemas.openxmlformats.org/drawingml/2006/picture">
+                  <pic:nvPicPr>
+                    <pic:cNvPr id="0" name="sonar002-login.png"/>
+                    <pic:cNvPicPr/>
+                  </pic:nvPicPr>
+                  <pic:blipFill>
+                    <a:blip r:embed="rId16"/>
+                    <a:stretch>
+                      <a:fillRect/>
+                    </a:stretch>
+                  </pic:blipFill>
+                  <pic:spPr>
+                    <a:xfrm>
+                      <a:off x="0" y="0"/>
+                      <a:ext cx="5100000" cy="5100000"/>
+                    </a:xfrm>
+                    <a:prstGeom prst="rect">
+                      <a:avLst/>
+                    </a:prstGeom>
+                  </pic:spPr>
+                </pic:pic>
+              </a:graphicData>
+            </a:graphic>
+          </wp:inline>
+        </w:drawing>
+      </w:r>
+    </w:p>
+    <w:p>
+      <w:r>
+        <w:br w:type="page"/>
+      </w:r>
+    </w:p>
+    <w:p>
+      <w:pPr>
+        <w:spacing w:after="140"/>
+        <w:keepNext/>
+        <w:outlineLvl w:val="1"/>
+      </w:pPr>
+      <w:r>
+        <w:rPr>
+          <w:rFonts w:ascii="Arial" w:hAnsi="Arial"/>
+          <w:sz w:val="27"/>
+          <w:lang w:val="eu-ES"/>
+          <w:b/>
+        </w:rPr>
+        <w:t xml:space="preserve">Erregistroko label eta id loturak</w:t>
+      </w:r>
+    </w:p>
+    <w:p>
+      <w:pPr>
+        <w:spacing w:after="140"/>
+      </w:pPr>
+      <w:r>
+        <w:rPr>
+          <w:rFonts w:ascii="Arial" w:hAnsi="Arial"/>
+          <w:sz w:val="22"/>
+          <w:lang w:val="eu-ES"/>
+        </w:rPr>
+        <w:t xml:space="preserve">Benetako tokiko webgunearen captura, HTTP bidez: 127.0.0.1:8081.</w:t>
+      </w:r>
+    </w:p>
+    <w:p>
+      <w:r>
+        <w:drawing>
+          <wp:inline distT="0" distB="0" distL="0" distR="0">
+            <wp:extent cx="5100000" cy="5100000"/>
+            <wp:docPr id="109" name="sonar002-register.png" descr="Erregistroko label eta id loturak"/>
+            <wp:cNvGraphicFramePr/>
+            <a:graphic xmlns:a="http://schemas.openxmlformats.org/drawingml/2006/main">
+              <a:graphicData uri="http://schemas.openxmlformats.org/drawingml/2006/picture">
+                <pic:pic xmlns:pic="http://schemas.openxmlformats.org/drawingml/2006/picture">
+                  <pic:nvPicPr>
+                    <pic:cNvPr id="0" name="sonar002-register.png"/>
+                    <pic:cNvPicPr/>
+                  </pic:nvPicPr>
+                  <pic:blipFill>
+                    <a:blip r:embed="rId17"/>
+                    <a:stretch>
+                      <a:fillRect/>
+                    </a:stretch>
+                  </pic:blipFill>
+                  <pic:spPr>
+                    <a:xfrm>
+                      <a:off x="0" y="0"/>
+                      <a:ext cx="5100000" cy="5100000"/>
+                    </a:xfrm>
+                    <a:prstGeom prst="rect">
+                      <a:avLst/>
+                    </a:prstGeom>
+                  </pic:spPr>
+                </pic:pic>
+              </a:graphicData>
+            </a:graphic>
+          </wp:inline>
+        </w:drawing>
+      </w:r>
+    </w:p>
+    <w:p>
+      <w:r>
+        <w:br w:type="page"/>
+      </w:r>
+    </w:p>
+    <w:p>
+      <w:pPr>
+        <w:spacing w:after="140"/>
+        <w:keepNext/>
+        <w:outlineLvl w:val="1"/>
+      </w:pPr>
+      <w:r>
+        <w:rPr>
+          <w:rFonts w:ascii="Arial" w:hAnsi="Arial"/>
+          <w:sz w:val="27"/>
+          <w:lang w:val="eu-ES"/>
+          <w:b/>
+        </w:rPr>
+        <w:t xml:space="preserve">Katalogoa zuzenketen ondoren</w:t>
+      </w:r>
+    </w:p>
+    <w:p>
+      <w:pPr>
+        <w:spacing w:after="140"/>
+      </w:pPr>
+      <w:r>
+        <w:rPr>
+          <w:rFonts w:ascii="Arial" w:hAnsi="Arial"/>
+          <w:sz w:val="22"/>
+          <w:lang w:val="eu-ES"/>
+        </w:rPr>
+        <w:t xml:space="preserve">Benetako tokiko webgunearen captura, HTTP bidez: 127.0.0.1:8081.</w:t>
+      </w:r>
+    </w:p>
+    <w:p>
+      <w:r>
+        <w:drawing>
+          <wp:inline distT="0" distB="0" distL="0" distR="0">
+            <wp:extent cx="5100000" cy="5100000"/>
+            <wp:docPr id="110" name="sonar002-index.png" descr="Katalogoa zuzenketen ondoren"/>
+            <wp:cNvGraphicFramePr/>
+            <a:graphic xmlns:a="http://schemas.openxmlformats.org/drawingml/2006/main">
+              <a:graphicData uri="http://schemas.openxmlformats.org/drawingml/2006/picture">
+                <pic:pic xmlns:pic="http://schemas.openxmlformats.org/drawingml/2006/picture">
+                  <pic:nvPicPr>
+                    <pic:cNvPr id="0" name="sonar002-index.png"/>
+                    <pic:cNvPicPr/>
+                  </pic:nvPicPr>
+                  <pic:blipFill>
+                    <a:blip r:embed="rId18"/>
+                    <a:stretch>
+                      <a:fillRect/>
+                    </a:stretch>
+                  </pic:blipFill>
+                  <pic:spPr>
+                    <a:xfrm>
+                      <a:off x="0" y="0"/>
+                      <a:ext cx="5100000" cy="5100000"/>
                     </a:xfrm>
                     <a:prstGeom prst="rect">
                       <a:avLst/>

</xml_diff>